<commit_message>
1Chronicles 배지 정밀화 (OT 전수조사): ch12/ch18/ch25 추가 정정 + ch10 EN/KO 판정 유지 (KO 텍스트 재분할 금지). 독스 29/29 export-back OK.
</commit_message>
<xml_diff>
--- a/gdocs_build/1Chronicles.docx
+++ b/gdocs_build/1Chronicles.docx
@@ -93,7 +93,7 @@
                 <w:b/>
                 <w:sz w:val="16"/>
               </w:rPr>
-              <w:t>1-4</w:t>
+              <w:t>1</w:t>
             </w:r>
           </w:p>
           <w:p>
@@ -196,7 +196,7 @@
                 <w:b/>
                 <w:sz w:val="16"/>
               </w:rPr>
-              <w:t>1-4</w:t>
+              <w:t>1</w:t>
             </w:r>
           </w:p>
           <w:p>
@@ -219,7 +219,7 @@
                 <w:b/>
                 <w:sz w:val="16"/>
               </w:rPr>
-              <w:t>1-4</w:t>
+              <w:t>1</w:t>
             </w:r>
           </w:p>
           <w:p>
@@ -244,7 +244,7 @@
                 <w:b/>
                 <w:sz w:val="16"/>
               </w:rPr>
-              <w:t>1-4</w:t>
+              <w:t>2</w:t>
             </w:r>
           </w:p>
           <w:p>
@@ -267,7 +267,7 @@
                 <w:b/>
                 <w:sz w:val="16"/>
               </w:rPr>
-              <w:t>1-4</w:t>
+              <w:t>2</w:t>
             </w:r>
           </w:p>
           <w:p>
@@ -290,7 +290,7 @@
                 <w:b/>
                 <w:sz w:val="16"/>
               </w:rPr>
-              <w:t>1-4</w:t>
+              <w:t>2</w:t>
             </w:r>
           </w:p>
           <w:p>
@@ -315,7 +315,7 @@
                 <w:b/>
                 <w:sz w:val="16"/>
               </w:rPr>
-              <w:t>1-4</w:t>
+              <w:t>3</w:t>
             </w:r>
           </w:p>
           <w:p>
@@ -338,7 +338,7 @@
                 <w:b/>
                 <w:sz w:val="16"/>
               </w:rPr>
-              <w:t>1-4</w:t>
+              <w:t>3</w:t>
             </w:r>
           </w:p>
           <w:p>
@@ -361,7 +361,7 @@
                 <w:b/>
                 <w:sz w:val="16"/>
               </w:rPr>
-              <w:t>1-4</w:t>
+              <w:t>3</w:t>
             </w:r>
           </w:p>
           <w:p>
@@ -386,7 +386,7 @@
                 <w:b/>
                 <w:sz w:val="16"/>
               </w:rPr>
-              <w:t>1-4</w:t>
+              <w:t>4</w:t>
             </w:r>
           </w:p>
           <w:p>
@@ -409,7 +409,7 @@
                 <w:b/>
                 <w:sz w:val="16"/>
               </w:rPr>
-              <w:t>1-4</w:t>
+              <w:t>4</w:t>
             </w:r>
           </w:p>
           <w:p>
@@ -432,7 +432,7 @@
                 <w:b/>
                 <w:sz w:val="16"/>
               </w:rPr>
-              <w:t>1-4</w:t>
+              <w:t>4</w:t>
             </w:r>
           </w:p>
           <w:p>
@@ -457,7 +457,7 @@
                 <w:b/>
                 <w:sz w:val="16"/>
               </w:rPr>
-              <w:t>1-4</w:t>
+              <w:t>4</w:t>
             </w:r>
           </w:p>
           <w:p>
@@ -480,7 +480,7 @@
                 <w:b/>
                 <w:sz w:val="16"/>
               </w:rPr>
-              <w:t>1-4</w:t>
+              <w:t>4</w:t>
             </w:r>
           </w:p>
           <w:p>
@@ -503,7 +503,7 @@
                 <w:b/>
                 <w:sz w:val="16"/>
               </w:rPr>
-              <w:t>1-4</w:t>
+              <w:t>4</w:t>
             </w:r>
           </w:p>
           <w:p>
@@ -1743,7 +1743,7 @@
                 <w:b/>
                 <w:sz w:val="16"/>
               </w:rPr>
-              <w:t>43-51</w:t>
+              <w:t>43</w:t>
             </w:r>
           </w:p>
           <w:p>
@@ -1838,7 +1838,7 @@
                 <w:b/>
                 <w:sz w:val="16"/>
               </w:rPr>
-              <w:t>43-51</w:t>
+              <w:t>43</w:t>
             </w:r>
           </w:p>
           <w:p>
@@ -1861,7 +1861,7 @@
                 <w:b/>
                 <w:sz w:val="16"/>
               </w:rPr>
-              <w:t>43-51</w:t>
+              <w:t>43</w:t>
             </w:r>
           </w:p>
           <w:p>
@@ -1886,7 +1886,7 @@
                 <w:b/>
                 <w:sz w:val="16"/>
               </w:rPr>
-              <w:t>43-51</w:t>
+              <w:t>43</w:t>
             </w:r>
           </w:p>
           <w:p>
@@ -1909,7 +1909,7 @@
                 <w:b/>
                 <w:sz w:val="16"/>
               </w:rPr>
-              <w:t>43-51</w:t>
+              <w:t>43</w:t>
             </w:r>
           </w:p>
           <w:p>
@@ -1932,7 +1932,7 @@
                 <w:b/>
                 <w:sz w:val="16"/>
               </w:rPr>
-              <w:t>43-51</w:t>
+              <w:t>43</w:t>
             </w:r>
           </w:p>
           <w:p>
@@ -1957,7 +1957,7 @@
                 <w:b/>
                 <w:sz w:val="16"/>
               </w:rPr>
-              <w:t>43-51</w:t>
+              <w:t>44</w:t>
             </w:r>
           </w:p>
           <w:p>
@@ -1980,7 +1980,7 @@
                 <w:b/>
                 <w:sz w:val="16"/>
               </w:rPr>
-              <w:t>43-51</w:t>
+              <w:t>44</w:t>
             </w:r>
           </w:p>
           <w:p>
@@ -2003,7 +2003,7 @@
                 <w:b/>
                 <w:sz w:val="16"/>
               </w:rPr>
-              <w:t>43-51</w:t>
+              <w:t>44</w:t>
             </w:r>
           </w:p>
           <w:p>
@@ -2028,7 +2028,7 @@
                 <w:b/>
                 <w:sz w:val="16"/>
               </w:rPr>
-              <w:t>43-51</w:t>
+              <w:t>45</w:t>
             </w:r>
           </w:p>
           <w:p>
@@ -2051,7 +2051,7 @@
                 <w:b/>
                 <w:sz w:val="16"/>
               </w:rPr>
-              <w:t>43-51</w:t>
+              <w:t>45</w:t>
             </w:r>
           </w:p>
           <w:p>
@@ -2074,7 +2074,7 @@
                 <w:b/>
                 <w:sz w:val="16"/>
               </w:rPr>
-              <w:t>43-51</w:t>
+              <w:t>45</w:t>
             </w:r>
           </w:p>
           <w:p>
@@ -2099,7 +2099,7 @@
                 <w:b/>
                 <w:sz w:val="16"/>
               </w:rPr>
-              <w:t>43-51</w:t>
+              <w:t>46</w:t>
             </w:r>
           </w:p>
           <w:p>
@@ -2122,7 +2122,7 @@
                 <w:b/>
                 <w:sz w:val="16"/>
               </w:rPr>
-              <w:t>43-51</w:t>
+              <w:t>46</w:t>
             </w:r>
           </w:p>
           <w:p>
@@ -2145,7 +2145,7 @@
                 <w:b/>
                 <w:sz w:val="16"/>
               </w:rPr>
-              <w:t>43-51</w:t>
+              <w:t>46</w:t>
             </w:r>
           </w:p>
           <w:p>
@@ -2170,7 +2170,7 @@
                 <w:b/>
                 <w:sz w:val="16"/>
               </w:rPr>
-              <w:t>43-51</w:t>
+              <w:t>47</w:t>
             </w:r>
           </w:p>
           <w:p>
@@ -2193,7 +2193,7 @@
                 <w:b/>
                 <w:sz w:val="16"/>
               </w:rPr>
-              <w:t>43-51</w:t>
+              <w:t>47</w:t>
             </w:r>
           </w:p>
           <w:p>
@@ -2216,7 +2216,7 @@
                 <w:b/>
                 <w:sz w:val="16"/>
               </w:rPr>
-              <w:t>43-51</w:t>
+              <w:t>47</w:t>
             </w:r>
           </w:p>
           <w:p>
@@ -2241,7 +2241,7 @@
                 <w:b/>
                 <w:sz w:val="16"/>
               </w:rPr>
-              <w:t>43-51</w:t>
+              <w:t>48</w:t>
             </w:r>
           </w:p>
           <w:p>
@@ -2264,7 +2264,7 @@
                 <w:b/>
                 <w:sz w:val="16"/>
               </w:rPr>
-              <w:t>43-51</w:t>
+              <w:t>48</w:t>
             </w:r>
           </w:p>
           <w:p>
@@ -2287,7 +2287,7 @@
                 <w:b/>
                 <w:sz w:val="16"/>
               </w:rPr>
-              <w:t>43-51</w:t>
+              <w:t>48</w:t>
             </w:r>
           </w:p>
           <w:p>
@@ -2312,7 +2312,7 @@
                 <w:b/>
                 <w:sz w:val="16"/>
               </w:rPr>
-              <w:t>43-51</w:t>
+              <w:t>49</w:t>
             </w:r>
           </w:p>
           <w:p>
@@ -2335,7 +2335,7 @@
                 <w:b/>
                 <w:sz w:val="16"/>
               </w:rPr>
-              <w:t>43-51</w:t>
+              <w:t>49</w:t>
             </w:r>
           </w:p>
           <w:p>
@@ -2358,7 +2358,7 @@
                 <w:b/>
                 <w:sz w:val="16"/>
               </w:rPr>
-              <w:t>43-51</w:t>
+              <w:t>49</w:t>
             </w:r>
           </w:p>
           <w:p>
@@ -2383,7 +2383,7 @@
                 <w:b/>
                 <w:sz w:val="16"/>
               </w:rPr>
-              <w:t>43-51</w:t>
+              <w:t>50</w:t>
             </w:r>
           </w:p>
           <w:p>
@@ -2406,7 +2406,7 @@
                 <w:b/>
                 <w:sz w:val="16"/>
               </w:rPr>
-              <w:t>43-51</w:t>
+              <w:t>50</w:t>
             </w:r>
           </w:p>
           <w:p>
@@ -2429,7 +2429,7 @@
                 <w:b/>
                 <w:sz w:val="16"/>
               </w:rPr>
-              <w:t>43-51</w:t>
+              <w:t>50</w:t>
             </w:r>
           </w:p>
           <w:p>
@@ -2454,30 +2454,30 @@
                 <w:b/>
                 <w:sz w:val="16"/>
               </w:rPr>
-              <w:t>43-51</w:t>
-            </w:r>
-          </w:p>
-          <w:p>
-            <w:r>
-              <w:rPr>
-                <w:sz w:val="18"/>
-              </w:rPr>
-              <w:t>↑ 위 MSG(43-51) 계속</w:t>
-            </w:r>
-          </w:p>
-        </w:tc>
-        <w:tc>
-          <w:tcPr>
-            <w:tcW w:type="dxa" w:w="2880"/>
-          </w:tcPr>
-          <w:p>
-            <w:r/>
-            <w:r>
-              <w:rPr>
-                <w:b/>
-                <w:sz w:val="16"/>
-              </w:rPr>
-              <w:t>43-51</w:t>
+              <w:t>51</w:t>
+            </w:r>
+          </w:p>
+          <w:p>
+            <w:r>
+              <w:rPr>
+                <w:sz w:val="18"/>
+              </w:rPr>
+              <w:t>The chieftains of Edom after that were Chief Timna, Chief Alvah, Chief Jetheth, Chief Oholibamah, Chief Elah, Chief Pinon, Chief Kenaz, Chief Teman, Chief Mibzar, Chief Magdiel, and Chief Iram. These were the chieftains of Edom.</w:t>
+            </w:r>
+          </w:p>
+        </w:tc>
+        <w:tc>
+          <w:tcPr>
+            <w:tcW w:type="dxa" w:w="2880"/>
+          </w:tcPr>
+          <w:p>
+            <w:r/>
+            <w:r>
+              <w:rPr>
+                <w:b/>
+                <w:sz w:val="16"/>
+              </w:rPr>
+              <w:t>51</w:t>
             </w:r>
           </w:p>
           <w:p>
@@ -2500,7 +2500,7 @@
                 <w:b/>
                 <w:sz w:val="16"/>
               </w:rPr>
-              <w:t>43-51</w:t>
+              <w:t>51</w:t>
             </w:r>
           </w:p>
           <w:p>
@@ -2533,7 +2533,7 @@
               <w:rPr>
                 <w:sz w:val="18"/>
               </w:rPr>
-              <w:t>The chieftains of Edom after that were Chief Timna, Chief Alvah, Chief Jetheth, Chief Oholibamah, Chief Elah, Chief Pinon, Chief Kenaz, Chief Teman, Chief Mibzar, Chief Magdiel, and Chief Iram. These were the chieftains of Edom.</w:t>
+              <w:t>↑ 위 MSG(51-54) 계속</w:t>
             </w:r>
           </w:p>
         </w:tc>
@@ -3089,7 +3089,7 @@
                 <w:b/>
                 <w:sz w:val="16"/>
               </w:rPr>
-              <w:t>28-29</w:t>
+              <w:t>28</w:t>
             </w:r>
           </w:p>
           <w:p>
@@ -3120,7 +3120,7 @@
                 <w:b/>
                 <w:sz w:val="16"/>
               </w:rPr>
-              <w:t>28-29</w:t>
+              <w:t>28</w:t>
             </w:r>
           </w:p>
           <w:p>
@@ -3143,7 +3143,7 @@
                 <w:b/>
                 <w:sz w:val="16"/>
               </w:rPr>
-              <w:t>28-29</w:t>
+              <w:t>28</w:t>
             </w:r>
           </w:p>
           <w:p>
@@ -3168,7 +3168,7 @@
                 <w:b/>
                 <w:sz w:val="16"/>
               </w:rPr>
-              <w:t>28-29</w:t>
+              <w:t>29</w:t>
             </w:r>
           </w:p>
           <w:p>
@@ -3191,7 +3191,7 @@
                 <w:b/>
                 <w:sz w:val="16"/>
               </w:rPr>
-              <w:t>28-29</w:t>
+              <w:t>29</w:t>
             </w:r>
           </w:p>
           <w:p>
@@ -3214,7 +3214,7 @@
                 <w:b/>
                 <w:sz w:val="16"/>
               </w:rPr>
-              <w:t>28-29</w:t>
+              <w:t>29</w:t>
             </w:r>
           </w:p>
           <w:p>
@@ -4379,7 +4379,7 @@
                 <w:b/>
                 <w:sz w:val="16"/>
               </w:rPr>
-              <w:t>1-3</w:t>
+              <w:t>1</w:t>
             </w:r>
           </w:p>
           <w:p>
@@ -4450,7 +4450,7 @@
                 <w:b/>
                 <w:sz w:val="16"/>
               </w:rPr>
-              <w:t>1-3</w:t>
+              <w:t>1</w:t>
             </w:r>
           </w:p>
           <w:p>
@@ -4473,7 +4473,7 @@
                 <w:b/>
                 <w:sz w:val="16"/>
               </w:rPr>
-              <w:t>1-3</w:t>
+              <w:t>1</w:t>
             </w:r>
           </w:p>
           <w:p>
@@ -4498,7 +4498,7 @@
                 <w:b/>
                 <w:sz w:val="16"/>
               </w:rPr>
-              <w:t>1-3</w:t>
+              <w:t>1</w:t>
             </w:r>
           </w:p>
           <w:p>
@@ -4521,7 +4521,7 @@
                 <w:b/>
                 <w:sz w:val="16"/>
               </w:rPr>
-              <w:t>1-3</w:t>
+              <w:t>1</w:t>
             </w:r>
           </w:p>
           <w:p>
@@ -4544,7 +4544,7 @@
                 <w:b/>
                 <w:sz w:val="16"/>
               </w:rPr>
-              <w:t>1-3</w:t>
+              <w:t>1</w:t>
             </w:r>
           </w:p>
           <w:p>
@@ -4569,7 +4569,7 @@
                 <w:b/>
                 <w:sz w:val="16"/>
               </w:rPr>
-              <w:t>1-3</w:t>
+              <w:t>1</w:t>
             </w:r>
           </w:p>
           <w:p>
@@ -4592,7 +4592,7 @@
                 <w:b/>
                 <w:sz w:val="16"/>
               </w:rPr>
-              <w:t>1-3</w:t>
+              <w:t>1</w:t>
             </w:r>
           </w:p>
           <w:p>
@@ -4615,7 +4615,7 @@
                 <w:b/>
                 <w:sz w:val="16"/>
               </w:rPr>
-              <w:t>1-3</w:t>
+              <w:t>1</w:t>
             </w:r>
           </w:p>
           <w:p>
@@ -4640,7 +4640,7 @@
                 <w:b/>
                 <w:sz w:val="16"/>
               </w:rPr>
-              <w:t>1-3</w:t>
+              <w:t>2</w:t>
             </w:r>
           </w:p>
           <w:p>
@@ -4663,7 +4663,7 @@
                 <w:b/>
                 <w:sz w:val="16"/>
               </w:rPr>
-              <w:t>1-3</w:t>
+              <w:t>2</w:t>
             </w:r>
           </w:p>
           <w:p>
@@ -4686,7 +4686,7 @@
                 <w:b/>
                 <w:sz w:val="16"/>
               </w:rPr>
-              <w:t>1-3</w:t>
+              <w:t>2</w:t>
             </w:r>
           </w:p>
           <w:p>
@@ -4711,7 +4711,7 @@
                 <w:b/>
                 <w:sz w:val="16"/>
               </w:rPr>
-              <w:t>1-3</w:t>
+              <w:t>2</w:t>
             </w:r>
           </w:p>
           <w:p>
@@ -4734,7 +4734,7 @@
                 <w:b/>
                 <w:sz w:val="16"/>
               </w:rPr>
-              <w:t>1-3</w:t>
+              <w:t>2</w:t>
             </w:r>
           </w:p>
           <w:p>
@@ -4757,7 +4757,7 @@
                 <w:b/>
                 <w:sz w:val="16"/>
               </w:rPr>
-              <w:t>1-3</w:t>
+              <w:t>2</w:t>
             </w:r>
           </w:p>
           <w:p>
@@ -4782,7 +4782,7 @@
                 <w:b/>
                 <w:sz w:val="16"/>
               </w:rPr>
-              <w:t>1-3</w:t>
+              <w:t>3</w:t>
             </w:r>
           </w:p>
           <w:p>
@@ -4805,7 +4805,7 @@
                 <w:b/>
                 <w:sz w:val="16"/>
               </w:rPr>
-              <w:t>1-3</w:t>
+              <w:t>3</w:t>
             </w:r>
           </w:p>
           <w:p>
@@ -4828,7 +4828,7 @@
                 <w:b/>
                 <w:sz w:val="16"/>
               </w:rPr>
-              <w:t>1-3</w:t>
+              <w:t>3</w:t>
             </w:r>
           </w:p>
           <w:p>
@@ -4853,7 +4853,7 @@
                 <w:b/>
                 <w:sz w:val="16"/>
               </w:rPr>
-              <w:t>1-3</w:t>
+              <w:t>3</w:t>
             </w:r>
           </w:p>
           <w:p>
@@ -4876,7 +4876,7 @@
                 <w:b/>
                 <w:sz w:val="16"/>
               </w:rPr>
-              <w:t>1-3</w:t>
+              <w:t>3</w:t>
             </w:r>
           </w:p>
           <w:p>
@@ -4899,7 +4899,7 @@
                 <w:b/>
                 <w:sz w:val="16"/>
               </w:rPr>
-              <w:t>1-3</w:t>
+              <w:t>3</w:t>
             </w:r>
           </w:p>
           <w:p>
@@ -4924,7 +4924,7 @@
                 <w:b/>
                 <w:sz w:val="16"/>
               </w:rPr>
-              <w:t>4-9</w:t>
+              <w:t>4</w:t>
             </w:r>
           </w:p>
           <w:p>
@@ -4955,7 +4955,7 @@
                 <w:b/>
                 <w:sz w:val="16"/>
               </w:rPr>
-              <w:t>4-9</w:t>
+              <w:t>4</w:t>
             </w:r>
           </w:p>
           <w:p>
@@ -4978,7 +4978,7 @@
                 <w:b/>
                 <w:sz w:val="16"/>
               </w:rPr>
-              <w:t>4-9</w:t>
+              <w:t>4</w:t>
             </w:r>
           </w:p>
           <w:p>
@@ -5003,7 +5003,7 @@
                 <w:b/>
                 <w:sz w:val="16"/>
               </w:rPr>
-              <w:t>4-9</w:t>
+              <w:t>5-9</w:t>
             </w:r>
           </w:p>
           <w:p>
@@ -5026,7 +5026,7 @@
                 <w:b/>
                 <w:sz w:val="16"/>
               </w:rPr>
-              <w:t>4-9</w:t>
+              <w:t>5-9</w:t>
             </w:r>
           </w:p>
           <w:p>
@@ -5049,7 +5049,7 @@
                 <w:b/>
                 <w:sz w:val="16"/>
               </w:rPr>
-              <w:t>4-9</w:t>
+              <w:t>5-9</w:t>
             </w:r>
           </w:p>
           <w:p>
@@ -11034,7 +11034,7 @@
                 <w:b/>
                 <w:sz w:val="16"/>
               </w:rPr>
-              <w:t>1-5</w:t>
+              <w:t>1</w:t>
             </w:r>
           </w:p>
           <w:p>
@@ -11057,7 +11057,7 @@
                 <w:b/>
                 <w:sz w:val="16"/>
               </w:rPr>
-              <w:t>1-5</w:t>
+              <w:t>1</w:t>
             </w:r>
           </w:p>
           <w:p>
@@ -11080,7 +11080,7 @@
                 <w:b/>
                 <w:sz w:val="16"/>
               </w:rPr>
-              <w:t>1-5</w:t>
+              <w:t>1</w:t>
             </w:r>
           </w:p>
           <w:p>
@@ -11105,7 +11105,7 @@
                 <w:b/>
                 <w:sz w:val="16"/>
               </w:rPr>
-              <w:t>1-5</w:t>
+              <w:t>2-4</w:t>
             </w:r>
           </w:p>
           <w:p>
@@ -11128,7 +11128,7 @@
                 <w:b/>
                 <w:sz w:val="16"/>
               </w:rPr>
-              <w:t>1-5</w:t>
+              <w:t>2-4</w:t>
             </w:r>
           </w:p>
           <w:p>
@@ -11151,7 +11151,7 @@
                 <w:b/>
                 <w:sz w:val="16"/>
               </w:rPr>
-              <w:t>1-5</w:t>
+              <w:t>2-4</w:t>
             </w:r>
           </w:p>
           <w:p>
@@ -11176,7 +11176,7 @@
                 <w:b/>
                 <w:sz w:val="16"/>
               </w:rPr>
-              <w:t>1-5</w:t>
+              <w:t>4-5</w:t>
             </w:r>
           </w:p>
           <w:p>
@@ -11199,7 +11199,7 @@
                 <w:b/>
                 <w:sz w:val="16"/>
               </w:rPr>
-              <w:t>1-5</w:t>
+              <w:t>4-5</w:t>
             </w:r>
           </w:p>
           <w:p>
@@ -11222,7 +11222,7 @@
                 <w:b/>
                 <w:sz w:val="16"/>
               </w:rPr>
-              <w:t>1-5</w:t>
+              <w:t>4-5</w:t>
             </w:r>
           </w:p>
           <w:p>
@@ -11811,7 +11811,7 @@
                 <w:b/>
                 <w:sz w:val="16"/>
               </w:rPr>
-              <w:t>10-11</w:t>
+              <w:t>10</w:t>
             </w:r>
           </w:p>
           <w:p>
@@ -11842,7 +11842,7 @@
                 <w:b/>
                 <w:sz w:val="16"/>
               </w:rPr>
-              <w:t>10-11</w:t>
+              <w:t>10</w:t>
             </w:r>
           </w:p>
           <w:p>
@@ -11865,7 +11865,7 @@
                 <w:b/>
                 <w:sz w:val="16"/>
               </w:rPr>
-              <w:t>10-11</w:t>
+              <w:t>10</w:t>
             </w:r>
           </w:p>
           <w:p>
@@ -11890,7 +11890,7 @@
                 <w:b/>
                 <w:sz w:val="16"/>
               </w:rPr>
-              <w:t>10-11</w:t>
+              <w:t>11</w:t>
             </w:r>
           </w:p>
           <w:p>
@@ -11913,7 +11913,7 @@
                 <w:b/>
                 <w:sz w:val="16"/>
               </w:rPr>
-              <w:t>10-11</w:t>
+              <w:t>11</w:t>
             </w:r>
           </w:p>
           <w:p>
@@ -11936,7 +11936,7 @@
                 <w:b/>
                 <w:sz w:val="16"/>
               </w:rPr>
-              <w:t>10-11</w:t>
+              <w:t>11</w:t>
             </w:r>
           </w:p>
           <w:p>
@@ -12383,7 +12383,7 @@
                 <w:b/>
                 <w:sz w:val="16"/>
               </w:rPr>
-              <w:t>1-2</w:t>
+              <w:t>1</w:t>
             </w:r>
           </w:p>
           <w:p>
@@ -12406,7 +12406,7 @@
                 <w:b/>
                 <w:sz w:val="16"/>
               </w:rPr>
-              <w:t>1-2</w:t>
+              <w:t>1</w:t>
             </w:r>
           </w:p>
           <w:p>
@@ -12429,7 +12429,7 @@
                 <w:b/>
                 <w:sz w:val="16"/>
               </w:rPr>
-              <w:t>1-2</w:t>
+              <w:t>1</w:t>
             </w:r>
           </w:p>
           <w:p>
@@ -12454,7 +12454,7 @@
                 <w:b/>
                 <w:sz w:val="16"/>
               </w:rPr>
-              <w:t>1-2</w:t>
+              <w:t>2</w:t>
             </w:r>
           </w:p>
           <w:p>
@@ -12477,7 +12477,7 @@
                 <w:b/>
                 <w:sz w:val="16"/>
               </w:rPr>
-              <w:t>1-2</w:t>
+              <w:t>2</w:t>
             </w:r>
           </w:p>
           <w:p>
@@ -12500,7 +12500,7 @@
                 <w:b/>
                 <w:sz w:val="16"/>
               </w:rPr>
-              <w:t>1-2</w:t>
+              <w:t>2</w:t>
             </w:r>
           </w:p>
           <w:p>
@@ -13318,7 +13318,7 @@
                 <w:b/>
                 <w:sz w:val="16"/>
               </w:rPr>
-              <w:t>1-14</w:t>
+              <w:t>1-3</w:t>
             </w:r>
           </w:p>
           <w:p>
@@ -13341,7 +13341,7 @@
                 <w:b/>
                 <w:sz w:val="16"/>
               </w:rPr>
-              <w:t>1-14</w:t>
+              <w:t>1-3</w:t>
             </w:r>
           </w:p>
           <w:p>
@@ -13364,7 +13364,7 @@
                 <w:b/>
                 <w:sz w:val="16"/>
               </w:rPr>
-              <w:t>1-14</w:t>
+              <w:t>1-3</w:t>
             </w:r>
           </w:p>
           <w:p>
@@ -13389,7 +13389,7 @@
                 <w:b/>
                 <w:sz w:val="16"/>
               </w:rPr>
-              <w:t>1-14</w:t>
+              <w:t>4-5</w:t>
             </w:r>
           </w:p>
           <w:p>
@@ -13412,7 +13412,7 @@
                 <w:b/>
                 <w:sz w:val="16"/>
               </w:rPr>
-              <w:t>1-14</w:t>
+              <w:t>4-5</w:t>
             </w:r>
           </w:p>
           <w:p>
@@ -13435,7 +13435,7 @@
                 <w:b/>
                 <w:sz w:val="16"/>
               </w:rPr>
-              <w:t>1-14</w:t>
+              <w:t>4-5</w:t>
             </w:r>
           </w:p>
           <w:p>
@@ -13460,7 +13460,7 @@
                 <w:b/>
                 <w:sz w:val="16"/>
               </w:rPr>
-              <w:t>1-14</w:t>
+              <w:t>6-7</w:t>
             </w:r>
           </w:p>
           <w:p>
@@ -13483,7 +13483,7 @@
                 <w:b/>
                 <w:sz w:val="16"/>
               </w:rPr>
-              <w:t>1-14</w:t>
+              <w:t>6-7</w:t>
             </w:r>
           </w:p>
           <w:p>
@@ -13506,7 +13506,7 @@
                 <w:b/>
                 <w:sz w:val="16"/>
               </w:rPr>
-              <w:t>1-14</w:t>
+              <w:t>6-7</w:t>
             </w:r>
           </w:p>
           <w:p>
@@ -13531,7 +13531,7 @@
                 <w:b/>
                 <w:sz w:val="16"/>
               </w:rPr>
-              <w:t>1-14</w:t>
+              <w:t>8-9</w:t>
             </w:r>
           </w:p>
           <w:p>
@@ -13554,7 +13554,7 @@
                 <w:b/>
                 <w:sz w:val="16"/>
               </w:rPr>
-              <w:t>1-14</w:t>
+              <w:t>8-9</w:t>
             </w:r>
           </w:p>
           <w:p>
@@ -13577,7 +13577,7 @@
                 <w:b/>
                 <w:sz w:val="16"/>
               </w:rPr>
-              <w:t>1-14</w:t>
+              <w:t>8-9</w:t>
             </w:r>
           </w:p>
           <w:p>
@@ -13602,7 +13602,7 @@
                 <w:b/>
                 <w:sz w:val="16"/>
               </w:rPr>
-              <w:t>1-14</w:t>
+              <w:t>10-14</w:t>
             </w:r>
           </w:p>
           <w:p>
@@ -13625,7 +13625,7 @@
                 <w:b/>
                 <w:sz w:val="16"/>
               </w:rPr>
-              <w:t>1-14</w:t>
+              <w:t>10-14</w:t>
             </w:r>
           </w:p>
           <w:p>
@@ -13648,7 +13648,7 @@
                 <w:b/>
                 <w:sz w:val="16"/>
               </w:rPr>
-              <w:t>1-14</w:t>
+              <w:t>10-14</w:t>
             </w:r>
           </w:p>
           <w:p>
@@ -14454,7 +14454,7 @@
                 <w:b/>
                 <w:sz w:val="16"/>
               </w:rPr>
-              <w:t>3-10</w:t>
+              <w:t>3</w:t>
             </w:r>
           </w:p>
           <w:p>
@@ -14477,7 +14477,7 @@
                 <w:b/>
                 <w:sz w:val="16"/>
               </w:rPr>
-              <w:t>3-10</w:t>
+              <w:t>3</w:t>
             </w:r>
           </w:p>
           <w:p>
@@ -14500,7 +14500,7 @@
                 <w:b/>
                 <w:sz w:val="16"/>
               </w:rPr>
-              <w:t>3-10</w:t>
+              <w:t>3</w:t>
             </w:r>
           </w:p>
           <w:p>
@@ -14525,7 +14525,7 @@
                 <w:b/>
                 <w:sz w:val="16"/>
               </w:rPr>
-              <w:t>3-10</w:t>
+              <w:t>4-10</w:t>
             </w:r>
           </w:p>
           <w:p>
@@ -14548,7 +14548,7 @@
                 <w:b/>
                 <w:sz w:val="16"/>
               </w:rPr>
-              <w:t>3-10</w:t>
+              <w:t>4-10</w:t>
             </w:r>
           </w:p>
           <w:p>
@@ -14571,7 +14571,7 @@
                 <w:b/>
                 <w:sz w:val="16"/>
               </w:rPr>
-              <w:t>3-10</w:t>
+              <w:t>4-10</w:t>
             </w:r>
           </w:p>
           <w:p>
@@ -15799,7 +15799,7 @@
                 <w:b/>
                 <w:sz w:val="16"/>
               </w:rPr>
-              <w:t>34-36</w:t>
+              <w:t>34-35</w:t>
             </w:r>
           </w:p>
           <w:p>
@@ -15830,7 +15830,7 @@
                 <w:b/>
                 <w:sz w:val="16"/>
               </w:rPr>
-              <w:t>34-36</w:t>
+              <w:t>34-35</w:t>
             </w:r>
           </w:p>
           <w:p>
@@ -15853,7 +15853,7 @@
                 <w:b/>
                 <w:sz w:val="16"/>
               </w:rPr>
-              <w:t>34-36</w:t>
+              <w:t>34-35</w:t>
             </w:r>
           </w:p>
           <w:p>
@@ -15878,7 +15878,7 @@
                 <w:b/>
                 <w:sz w:val="16"/>
               </w:rPr>
-              <w:t>34-36</w:t>
+              <w:t>36</w:t>
             </w:r>
           </w:p>
           <w:p>
@@ -15901,7 +15901,7 @@
                 <w:b/>
                 <w:sz w:val="16"/>
               </w:rPr>
-              <w:t>34-36</w:t>
+              <w:t>36</w:t>
             </w:r>
           </w:p>
           <w:p>
@@ -15924,7 +15924,7 @@
                 <w:b/>
                 <w:sz w:val="16"/>
               </w:rPr>
-              <w:t>34-36</w:t>
+              <w:t>36</w:t>
             </w:r>
           </w:p>
           <w:p>
@@ -16584,7 +16584,7 @@
                 <w:b/>
                 <w:sz w:val="16"/>
               </w:rPr>
-              <w:t>16-27</w:t>
+              <w:t>16</w:t>
             </w:r>
           </w:p>
           <w:p>
@@ -16623,7 +16623,7 @@
                 <w:b/>
                 <w:sz w:val="16"/>
               </w:rPr>
-              <w:t>16-27</w:t>
+              <w:t>16</w:t>
             </w:r>
           </w:p>
           <w:p>
@@ -16646,7 +16646,7 @@
                 <w:b/>
                 <w:sz w:val="16"/>
               </w:rPr>
-              <w:t>16-27</w:t>
+              <w:t>16</w:t>
             </w:r>
           </w:p>
           <w:p>
@@ -16671,7 +16671,7 @@
                 <w:b/>
                 <w:sz w:val="16"/>
               </w:rPr>
-              <w:t>16-27</w:t>
+              <w:t>17-22</w:t>
             </w:r>
           </w:p>
           <w:p>
@@ -16694,7 +16694,7 @@
                 <w:b/>
                 <w:sz w:val="16"/>
               </w:rPr>
-              <w:t>16-27</w:t>
+              <w:t>17-22</w:t>
             </w:r>
           </w:p>
           <w:p>
@@ -16717,7 +16717,7 @@
                 <w:b/>
                 <w:sz w:val="16"/>
               </w:rPr>
-              <w:t>16-27</w:t>
+              <w:t>17-22</w:t>
             </w:r>
           </w:p>
           <w:p>
@@ -16742,7 +16742,7 @@
                 <w:b/>
                 <w:sz w:val="16"/>
               </w:rPr>
-              <w:t>16-27</w:t>
+              <w:t>23-27</w:t>
             </w:r>
           </w:p>
           <w:p>
@@ -16765,7 +16765,7 @@
                 <w:b/>
                 <w:sz w:val="16"/>
               </w:rPr>
-              <w:t>16-27</w:t>
+              <w:t>23-27</w:t>
             </w:r>
           </w:p>
           <w:p>
@@ -16788,7 +16788,7 @@
                 <w:b/>
                 <w:sz w:val="16"/>
               </w:rPr>
-              <w:t>16-27</w:t>
+              <w:t>23-27</w:t>
             </w:r>
           </w:p>
           <w:p>
@@ -17306,7 +17306,7 @@
                 <w:b/>
                 <w:sz w:val="16"/>
               </w:rPr>
-              <w:t>12-13</w:t>
+              <w:t>12</w:t>
             </w:r>
           </w:p>
           <w:p>
@@ -17337,7 +17337,7 @@
                 <w:b/>
                 <w:sz w:val="16"/>
               </w:rPr>
-              <w:t>12-13</w:t>
+              <w:t>12</w:t>
             </w:r>
           </w:p>
           <w:p>
@@ -17360,7 +17360,7 @@
                 <w:b/>
                 <w:sz w:val="16"/>
               </w:rPr>
-              <w:t>12-13</w:t>
+              <w:t>12</w:t>
             </w:r>
           </w:p>
           <w:p>
@@ -17385,7 +17385,7 @@
                 <w:b/>
                 <w:sz w:val="16"/>
               </w:rPr>
-              <w:t>12-13</w:t>
+              <w:t>13</w:t>
             </w:r>
           </w:p>
           <w:p>
@@ -17408,7 +17408,7 @@
                 <w:b/>
                 <w:sz w:val="16"/>
               </w:rPr>
-              <w:t>12-13</w:t>
+              <w:t>13</w:t>
             </w:r>
           </w:p>
           <w:p>
@@ -17431,7 +17431,7 @@
                 <w:b/>
                 <w:sz w:val="16"/>
               </w:rPr>
-              <w:t>12-13</w:t>
+              <w:t>13</w:t>
             </w:r>
           </w:p>
           <w:p>
@@ -17456,7 +17456,7 @@
                 <w:b/>
                 <w:sz w:val="16"/>
               </w:rPr>
-              <w:t>14-17</w:t>
+              <w:t>14</w:t>
             </w:r>
           </w:p>
           <w:p>
@@ -17527,7 +17527,7 @@
                 <w:b/>
                 <w:sz w:val="16"/>
               </w:rPr>
-              <w:t>14-17</w:t>
+              <w:t>14</w:t>
             </w:r>
           </w:p>
           <w:p>
@@ -17550,7 +17550,7 @@
                 <w:b/>
                 <w:sz w:val="16"/>
               </w:rPr>
-              <w:t>14-17</w:t>
+              <w:t>14</w:t>
             </w:r>
           </w:p>
           <w:p>
@@ -17575,7 +17575,7 @@
                 <w:b/>
                 <w:sz w:val="16"/>
               </w:rPr>
-              <w:t>14-17</w:t>
+              <w:t>15</w:t>
             </w:r>
           </w:p>
           <w:p>
@@ -17598,7 +17598,7 @@
                 <w:b/>
                 <w:sz w:val="16"/>
               </w:rPr>
-              <w:t>14-17</w:t>
+              <w:t>15</w:t>
             </w:r>
           </w:p>
           <w:p>
@@ -17621,7 +17621,7 @@
                 <w:b/>
                 <w:sz w:val="16"/>
               </w:rPr>
-              <w:t>14-17</w:t>
+              <w:t>15</w:t>
             </w:r>
           </w:p>
           <w:p>
@@ -17646,7 +17646,7 @@
                 <w:b/>
                 <w:sz w:val="16"/>
               </w:rPr>
-              <w:t>14-17</w:t>
+              <w:t>15</w:t>
             </w:r>
           </w:p>
           <w:p>
@@ -17669,7 +17669,7 @@
                 <w:b/>
                 <w:sz w:val="16"/>
               </w:rPr>
-              <w:t>14-17</w:t>
+              <w:t>15</w:t>
             </w:r>
           </w:p>
           <w:p>
@@ -17692,7 +17692,7 @@
                 <w:b/>
                 <w:sz w:val="16"/>
               </w:rPr>
-              <w:t>14-17</w:t>
+              <w:t>15</w:t>
             </w:r>
           </w:p>
           <w:p>
@@ -17717,7 +17717,7 @@
                 <w:b/>
                 <w:sz w:val="16"/>
               </w:rPr>
-              <w:t>14-17</w:t>
+              <w:t>15</w:t>
             </w:r>
           </w:p>
           <w:p>
@@ -17740,7 +17740,7 @@
                 <w:b/>
                 <w:sz w:val="16"/>
               </w:rPr>
-              <w:t>14-17</w:t>
+              <w:t>15</w:t>
             </w:r>
           </w:p>
           <w:p>
@@ -17763,7 +17763,7 @@
                 <w:b/>
                 <w:sz w:val="16"/>
               </w:rPr>
-              <w:t>14-17</w:t>
+              <w:t>15</w:t>
             </w:r>
           </w:p>
           <w:p>
@@ -17788,7 +17788,7 @@
                 <w:b/>
                 <w:sz w:val="16"/>
               </w:rPr>
-              <w:t>14-17</w:t>
+              <w:t>16</w:t>
             </w:r>
           </w:p>
           <w:p>
@@ -17811,7 +17811,7 @@
                 <w:b/>
                 <w:sz w:val="16"/>
               </w:rPr>
-              <w:t>14-17</w:t>
+              <w:t>16</w:t>
             </w:r>
           </w:p>
           <w:p>
@@ -17834,7 +17834,7 @@
                 <w:b/>
                 <w:sz w:val="16"/>
               </w:rPr>
-              <w:t>14-17</w:t>
+              <w:t>16</w:t>
             </w:r>
           </w:p>
           <w:p>
@@ -17859,7 +17859,7 @@
                 <w:b/>
                 <w:sz w:val="16"/>
               </w:rPr>
-              <w:t>14-17</w:t>
+              <w:t>16</w:t>
             </w:r>
           </w:p>
           <w:p>
@@ -17882,7 +17882,7 @@
                 <w:b/>
                 <w:sz w:val="16"/>
               </w:rPr>
-              <w:t>14-17</w:t>
+              <w:t>16</w:t>
             </w:r>
           </w:p>
           <w:p>
@@ -17905,7 +17905,7 @@
                 <w:b/>
                 <w:sz w:val="16"/>
               </w:rPr>
-              <w:t>14-17</w:t>
+              <w:t>16</w:t>
             </w:r>
           </w:p>
           <w:p>
@@ -17930,7 +17930,7 @@
                 <w:b/>
                 <w:sz w:val="16"/>
               </w:rPr>
-              <w:t>14-17</w:t>
+              <w:t>17</w:t>
             </w:r>
           </w:p>
           <w:p>
@@ -17953,7 +17953,7 @@
                 <w:b/>
                 <w:sz w:val="16"/>
               </w:rPr>
-              <w:t>14-17</w:t>
+              <w:t>17</w:t>
             </w:r>
           </w:p>
           <w:p>
@@ -17976,7 +17976,7 @@
                 <w:b/>
                 <w:sz w:val="16"/>
               </w:rPr>
-              <w:t>14-17</w:t>
+              <w:t>17</w:t>
             </w:r>
           </w:p>
           <w:p>
@@ -18001,7 +18001,7 @@
                 <w:b/>
                 <w:sz w:val="16"/>
               </w:rPr>
-              <w:t>14-17</w:t>
+              <w:t>17</w:t>
             </w:r>
           </w:p>
           <w:p>
@@ -18024,7 +18024,7 @@
                 <w:b/>
                 <w:sz w:val="16"/>
               </w:rPr>
-              <w:t>14-17</w:t>
+              <w:t>17</w:t>
             </w:r>
           </w:p>
           <w:p>
@@ -18047,7 +18047,7 @@
                 <w:b/>
                 <w:sz w:val="16"/>
               </w:rPr>
-              <w:t>14-17</w:t>
+              <w:t>17</w:t>
             </w:r>
           </w:p>
           <w:p>
@@ -18636,7 +18636,7 @@
                 <w:b/>
                 <w:sz w:val="16"/>
               </w:rPr>
-              <w:t>14-15</w:t>
+              <w:t>14</w:t>
             </w:r>
           </w:p>
           <w:p>
@@ -18667,7 +18667,7 @@
                 <w:b/>
                 <w:sz w:val="16"/>
               </w:rPr>
-              <w:t>14-15</w:t>
+              <w:t>14</w:t>
             </w:r>
           </w:p>
           <w:p>
@@ -18690,7 +18690,7 @@
                 <w:b/>
                 <w:sz w:val="16"/>
               </w:rPr>
-              <w:t>14-15</w:t>
+              <w:t>14</w:t>
             </w:r>
           </w:p>
           <w:p>
@@ -18715,7 +18715,7 @@
                 <w:b/>
                 <w:sz w:val="16"/>
               </w:rPr>
-              <w:t>14-15</w:t>
+              <w:t>15</w:t>
             </w:r>
           </w:p>
           <w:p>
@@ -18738,7 +18738,7 @@
                 <w:b/>
                 <w:sz w:val="16"/>
               </w:rPr>
-              <w:t>14-15</w:t>
+              <w:t>15</w:t>
             </w:r>
           </w:p>
           <w:p>
@@ -18761,7 +18761,7 @@
                 <w:b/>
                 <w:sz w:val="16"/>
               </w:rPr>
-              <w:t>14-15</w:t>
+              <w:t>15</w:t>
             </w:r>
           </w:p>
           <w:p>
@@ -18995,7 +18995,7 @@
                 <w:b/>
                 <w:sz w:val="16"/>
               </w:rPr>
-              <w:t>1-3</w:t>
+              <w:t>1</w:t>
             </w:r>
           </w:p>
           <w:p>
@@ -19018,7 +19018,7 @@
                 <w:b/>
                 <w:sz w:val="16"/>
               </w:rPr>
-              <w:t>1-3</w:t>
+              <w:t>1</w:t>
             </w:r>
           </w:p>
           <w:p>
@@ -19041,7 +19041,7 @@
                 <w:b/>
                 <w:sz w:val="16"/>
               </w:rPr>
-              <w:t>1-3</w:t>
+              <w:t>1</w:t>
             </w:r>
           </w:p>
           <w:p>
@@ -19066,7 +19066,7 @@
                 <w:b/>
                 <w:sz w:val="16"/>
               </w:rPr>
-              <w:t>1-3</w:t>
+              <w:t>2-3</w:t>
             </w:r>
           </w:p>
           <w:p>
@@ -19089,7 +19089,7 @@
                 <w:b/>
                 <w:sz w:val="16"/>
               </w:rPr>
-              <w:t>1-3</w:t>
+              <w:t>2-3</w:t>
             </w:r>
           </w:p>
           <w:p>
@@ -19112,7 +19112,7 @@
                 <w:b/>
                 <w:sz w:val="16"/>
               </w:rPr>
-              <w:t>1-3</w:t>
+              <w:t>2-3</w:t>
             </w:r>
           </w:p>
           <w:p>
@@ -19137,7 +19137,7 @@
                 <w:b/>
                 <w:sz w:val="16"/>
               </w:rPr>
-              <w:t>4-8</w:t>
+              <w:t>4</w:t>
             </w:r>
           </w:p>
           <w:p>
@@ -19160,7 +19160,7 @@
                 <w:b/>
                 <w:sz w:val="16"/>
               </w:rPr>
-              <w:t>4-8</w:t>
+              <w:t>4</w:t>
             </w:r>
           </w:p>
           <w:p>
@@ -19183,7 +19183,7 @@
                 <w:b/>
                 <w:sz w:val="16"/>
               </w:rPr>
-              <w:t>4-8</w:t>
+              <w:t>4</w:t>
             </w:r>
           </w:p>
           <w:p>
@@ -19208,7 +19208,7 @@
                 <w:b/>
                 <w:sz w:val="16"/>
               </w:rPr>
-              <w:t>4-8</w:t>
+              <w:t>5</w:t>
             </w:r>
           </w:p>
           <w:p>
@@ -19231,7 +19231,7 @@
                 <w:b/>
                 <w:sz w:val="16"/>
               </w:rPr>
-              <w:t>4-8</w:t>
+              <w:t>5</w:t>
             </w:r>
           </w:p>
           <w:p>
@@ -19254,7 +19254,7 @@
                 <w:b/>
                 <w:sz w:val="16"/>
               </w:rPr>
-              <w:t>4-8</w:t>
+              <w:t>5</w:t>
             </w:r>
           </w:p>
           <w:p>
@@ -19279,7 +19279,7 @@
                 <w:b/>
                 <w:sz w:val="16"/>
               </w:rPr>
-              <w:t>4-8</w:t>
+              <w:t>6-7</w:t>
             </w:r>
           </w:p>
           <w:p>
@@ -19302,7 +19302,7 @@
                 <w:b/>
                 <w:sz w:val="16"/>
               </w:rPr>
-              <w:t>4-8</w:t>
+              <w:t>6-7</w:t>
             </w:r>
           </w:p>
           <w:p>
@@ -19325,7 +19325,7 @@
                 <w:b/>
                 <w:sz w:val="16"/>
               </w:rPr>
-              <w:t>4-8</w:t>
+              <w:t>6-7</w:t>
             </w:r>
           </w:p>
           <w:p>
@@ -19350,7 +19350,7 @@
                 <w:b/>
                 <w:sz w:val="16"/>
               </w:rPr>
-              <w:t>4-8</w:t>
+              <w:t>8</w:t>
             </w:r>
           </w:p>
           <w:p>
@@ -19373,7 +19373,7 @@
                 <w:b/>
                 <w:sz w:val="16"/>
               </w:rPr>
-              <w:t>4-8</w:t>
+              <w:t>8</w:t>
             </w:r>
           </w:p>
           <w:p>
@@ -19396,7 +19396,7 @@
                 <w:b/>
                 <w:sz w:val="16"/>
               </w:rPr>
-              <w:t>4-8</w:t>
+              <w:t>8</w:t>
             </w:r>
           </w:p>
           <w:p>
@@ -22032,7 +22032,7 @@
                 <w:b/>
                 <w:sz w:val="16"/>
               </w:rPr>
-              <w:t>1-5</w:t>
+              <w:t>1-2</w:t>
             </w:r>
           </w:p>
           <w:p>
@@ -22055,7 +22055,7 @@
                 <w:b/>
                 <w:sz w:val="16"/>
               </w:rPr>
-              <w:t>1-5</w:t>
+              <w:t>1-2</w:t>
             </w:r>
           </w:p>
           <w:p>
@@ -22078,7 +22078,7 @@
                 <w:b/>
                 <w:sz w:val="16"/>
               </w:rPr>
-              <w:t>1-5</w:t>
+              <w:t>1-2</w:t>
             </w:r>
           </w:p>
           <w:p>
@@ -22103,7 +22103,7 @@
                 <w:b/>
                 <w:sz w:val="16"/>
               </w:rPr>
-              <w:t>1-5</w:t>
+              <w:t>3-4</w:t>
             </w:r>
           </w:p>
           <w:p>
@@ -22126,7 +22126,7 @@
                 <w:b/>
                 <w:sz w:val="16"/>
               </w:rPr>
-              <w:t>1-5</w:t>
+              <w:t>3-4</w:t>
             </w:r>
           </w:p>
           <w:p>
@@ -22149,7 +22149,7 @@
                 <w:b/>
                 <w:sz w:val="16"/>
               </w:rPr>
-              <w:t>1-5</w:t>
+              <w:t>3-4</w:t>
             </w:r>
           </w:p>
           <w:p>
@@ -22174,7 +22174,7 @@
                 <w:b/>
                 <w:sz w:val="16"/>
               </w:rPr>
-              <w:t>1-5</w:t>
+              <w:t>5</w:t>
             </w:r>
           </w:p>
           <w:p>
@@ -22197,7 +22197,7 @@
                 <w:b/>
                 <w:sz w:val="16"/>
               </w:rPr>
-              <w:t>1-5</w:t>
+              <w:t>5</w:t>
             </w:r>
           </w:p>
           <w:p>
@@ -22220,7 +22220,7 @@
                 <w:b/>
                 <w:sz w:val="16"/>
               </w:rPr>
-              <w:t>1-5</w:t>
+              <w:t>5</w:t>
             </w:r>
           </w:p>
           <w:p>
@@ -23289,7 +23289,7 @@
                 <w:b/>
                 <w:sz w:val="16"/>
               </w:rPr>
-              <w:t>30-31</w:t>
+              <w:t>30</w:t>
             </w:r>
           </w:p>
           <w:p>
@@ -23320,7 +23320,7 @@
                 <w:b/>
                 <w:sz w:val="16"/>
               </w:rPr>
-              <w:t>30-31</w:t>
+              <w:t>30</w:t>
             </w:r>
           </w:p>
           <w:p>
@@ -23343,7 +23343,7 @@
                 <w:b/>
                 <w:sz w:val="16"/>
               </w:rPr>
-              <w:t>30-31</w:t>
+              <w:t>30</w:t>
             </w:r>
           </w:p>
           <w:p>
@@ -23368,7 +23368,7 @@
                 <w:b/>
                 <w:sz w:val="16"/>
               </w:rPr>
-              <w:t>30-31</w:t>
+              <w:t>31</w:t>
             </w:r>
           </w:p>
           <w:p>
@@ -23391,7 +23391,7 @@
                 <w:b/>
                 <w:sz w:val="16"/>
               </w:rPr>
-              <w:t>30-31</w:t>
+              <w:t>31</w:t>
             </w:r>
           </w:p>
           <w:p>
@@ -23414,7 +23414,7 @@
                 <w:b/>
                 <w:sz w:val="16"/>
               </w:rPr>
-              <w:t>30-31</w:t>
+              <w:t>31</w:t>
             </w:r>
           </w:p>
           <w:p>
@@ -23506,7 +23506,7 @@
                 <w:b/>
                 <w:sz w:val="16"/>
               </w:rPr>
-              <w:t>1-7</w:t>
+              <w:t>1</w:t>
             </w:r>
           </w:p>
           <w:p>
@@ -23529,7 +23529,7 @@
                 <w:b/>
                 <w:sz w:val="16"/>
               </w:rPr>
-              <w:t>1-7</w:t>
+              <w:t>1</w:t>
             </w:r>
           </w:p>
           <w:p>
@@ -23552,7 +23552,7 @@
                 <w:b/>
                 <w:sz w:val="16"/>
               </w:rPr>
-              <w:t>1-7</w:t>
+              <w:t>1</w:t>
             </w:r>
           </w:p>
           <w:p>
@@ -23577,7 +23577,7 @@
                 <w:b/>
                 <w:sz w:val="16"/>
               </w:rPr>
-              <w:t>1-7</w:t>
+              <w:t>2-7</w:t>
             </w:r>
           </w:p>
           <w:p>
@@ -23600,7 +23600,7 @@
                 <w:b/>
                 <w:sz w:val="16"/>
               </w:rPr>
-              <w:t>1-7</w:t>
+              <w:t>2-7</w:t>
             </w:r>
           </w:p>
           <w:p>
@@ -23623,7 +23623,7 @@
                 <w:b/>
                 <w:sz w:val="16"/>
               </w:rPr>
-              <w:t>1-7</w:t>
+              <w:t>2-7</w:t>
             </w:r>
           </w:p>
           <w:p>
@@ -25415,7 +25415,7 @@
                 <w:b/>
                 <w:sz w:val="16"/>
               </w:rPr>
-              <w:t>16-22</w:t>
+              <w:t>16</w:t>
             </w:r>
           </w:p>
           <w:p>
@@ -25550,7 +25550,7 @@
                 <w:b/>
                 <w:sz w:val="16"/>
               </w:rPr>
-              <w:t>16-22</w:t>
+              <w:t>16</w:t>
             </w:r>
           </w:p>
           <w:p>
@@ -25573,7 +25573,7 @@
                 <w:b/>
                 <w:sz w:val="16"/>
               </w:rPr>
-              <w:t>16-22</w:t>
+              <w:t>16</w:t>
             </w:r>
           </w:p>
           <w:p>
@@ -25598,7 +25598,7 @@
                 <w:b/>
                 <w:sz w:val="16"/>
               </w:rPr>
-              <w:t>16-22</w:t>
+              <w:t>16</w:t>
             </w:r>
           </w:p>
           <w:p>
@@ -25621,7 +25621,7 @@
                 <w:b/>
                 <w:sz w:val="16"/>
               </w:rPr>
-              <w:t>16-22</w:t>
+              <w:t>16</w:t>
             </w:r>
           </w:p>
           <w:p>
@@ -25644,7 +25644,7 @@
                 <w:b/>
                 <w:sz w:val="16"/>
               </w:rPr>
-              <w:t>16-22</w:t>
+              <w:t>16</w:t>
             </w:r>
           </w:p>
           <w:p>
@@ -25669,7 +25669,7 @@
                 <w:b/>
                 <w:sz w:val="16"/>
               </w:rPr>
-              <w:t>16-22</w:t>
+              <w:t>16</w:t>
             </w:r>
           </w:p>
           <w:p>
@@ -25692,7 +25692,7 @@
                 <w:b/>
                 <w:sz w:val="16"/>
               </w:rPr>
-              <w:t>16-22</w:t>
+              <w:t>16</w:t>
             </w:r>
           </w:p>
           <w:p>
@@ -25715,7 +25715,7 @@
                 <w:b/>
                 <w:sz w:val="16"/>
               </w:rPr>
-              <w:t>16-22</w:t>
+              <w:t>16</w:t>
             </w:r>
           </w:p>
           <w:p>
@@ -25740,7 +25740,7 @@
                 <w:b/>
                 <w:sz w:val="16"/>
               </w:rPr>
-              <w:t>16-22</w:t>
+              <w:t>17</w:t>
             </w:r>
           </w:p>
           <w:p>
@@ -25763,7 +25763,7 @@
                 <w:b/>
                 <w:sz w:val="16"/>
               </w:rPr>
-              <w:t>16-22</w:t>
+              <w:t>17</w:t>
             </w:r>
           </w:p>
           <w:p>
@@ -25786,7 +25786,7 @@
                 <w:b/>
                 <w:sz w:val="16"/>
               </w:rPr>
-              <w:t>16-22</w:t>
+              <w:t>17</w:t>
             </w:r>
           </w:p>
           <w:p>
@@ -25811,7 +25811,7 @@
                 <w:b/>
                 <w:sz w:val="16"/>
               </w:rPr>
-              <w:t>16-22</w:t>
+              <w:t>17</w:t>
             </w:r>
           </w:p>
           <w:p>
@@ -25834,7 +25834,7 @@
                 <w:b/>
                 <w:sz w:val="16"/>
               </w:rPr>
-              <w:t>16-22</w:t>
+              <w:t>17</w:t>
             </w:r>
           </w:p>
           <w:p>
@@ -25857,7 +25857,7 @@
                 <w:b/>
                 <w:sz w:val="16"/>
               </w:rPr>
-              <w:t>16-22</w:t>
+              <w:t>17</w:t>
             </w:r>
           </w:p>
           <w:p>
@@ -25882,7 +25882,7 @@
                 <w:b/>
                 <w:sz w:val="16"/>
               </w:rPr>
-              <w:t>16-22</w:t>
+              <w:t>18</w:t>
             </w:r>
           </w:p>
           <w:p>
@@ -25905,7 +25905,7 @@
                 <w:b/>
                 <w:sz w:val="16"/>
               </w:rPr>
-              <w:t>16-22</w:t>
+              <w:t>18</w:t>
             </w:r>
           </w:p>
           <w:p>
@@ -25928,7 +25928,7 @@
                 <w:b/>
                 <w:sz w:val="16"/>
               </w:rPr>
-              <w:t>16-22</w:t>
+              <w:t>18</w:t>
             </w:r>
           </w:p>
           <w:p>
@@ -25953,7 +25953,7 @@
                 <w:b/>
                 <w:sz w:val="16"/>
               </w:rPr>
-              <w:t>16-22</w:t>
+              <w:t>18</w:t>
             </w:r>
           </w:p>
           <w:p>
@@ -25976,7 +25976,7 @@
                 <w:b/>
                 <w:sz w:val="16"/>
               </w:rPr>
-              <w:t>16-22</w:t>
+              <w:t>18</w:t>
             </w:r>
           </w:p>
           <w:p>
@@ -25999,7 +25999,7 @@
                 <w:b/>
                 <w:sz w:val="16"/>
               </w:rPr>
-              <w:t>16-22</w:t>
+              <w:t>18</w:t>
             </w:r>
           </w:p>
           <w:p>
@@ -26024,7 +26024,7 @@
                 <w:b/>
                 <w:sz w:val="16"/>
               </w:rPr>
-              <w:t>16-22</w:t>
+              <w:t>19</w:t>
             </w:r>
           </w:p>
           <w:p>
@@ -26047,7 +26047,7 @@
                 <w:b/>
                 <w:sz w:val="16"/>
               </w:rPr>
-              <w:t>16-22</w:t>
+              <w:t>19</w:t>
             </w:r>
           </w:p>
           <w:p>
@@ -26070,7 +26070,7 @@
                 <w:b/>
                 <w:sz w:val="16"/>
               </w:rPr>
-              <w:t>16-22</w:t>
+              <w:t>19</w:t>
             </w:r>
           </w:p>
           <w:p>
@@ -26095,7 +26095,7 @@
                 <w:b/>
                 <w:sz w:val="16"/>
               </w:rPr>
-              <w:t>16-22</w:t>
+              <w:t>19</w:t>
             </w:r>
           </w:p>
           <w:p>
@@ -26118,7 +26118,7 @@
                 <w:b/>
                 <w:sz w:val="16"/>
               </w:rPr>
-              <w:t>16-22</w:t>
+              <w:t>19</w:t>
             </w:r>
           </w:p>
           <w:p>
@@ -26141,7 +26141,7 @@
                 <w:b/>
                 <w:sz w:val="16"/>
               </w:rPr>
-              <w:t>16-22</w:t>
+              <w:t>19</w:t>
             </w:r>
           </w:p>
           <w:p>
@@ -26166,7 +26166,7 @@
                 <w:b/>
                 <w:sz w:val="16"/>
               </w:rPr>
-              <w:t>16-22</w:t>
+              <w:t>20</w:t>
             </w:r>
           </w:p>
           <w:p>
@@ -26189,7 +26189,7 @@
                 <w:b/>
                 <w:sz w:val="16"/>
               </w:rPr>
-              <w:t>16-22</w:t>
+              <w:t>20</w:t>
             </w:r>
           </w:p>
           <w:p>
@@ -26212,7 +26212,7 @@
                 <w:b/>
                 <w:sz w:val="16"/>
               </w:rPr>
-              <w:t>16-22</w:t>
+              <w:t>20</w:t>
             </w:r>
           </w:p>
           <w:p>
@@ -26237,7 +26237,7 @@
                 <w:b/>
                 <w:sz w:val="16"/>
               </w:rPr>
-              <w:t>16-22</w:t>
+              <w:t>20</w:t>
             </w:r>
           </w:p>
           <w:p>
@@ -26260,7 +26260,7 @@
                 <w:b/>
                 <w:sz w:val="16"/>
               </w:rPr>
-              <w:t>16-22</w:t>
+              <w:t>20</w:t>
             </w:r>
           </w:p>
           <w:p>
@@ -26283,7 +26283,7 @@
                 <w:b/>
                 <w:sz w:val="16"/>
               </w:rPr>
-              <w:t>16-22</w:t>
+              <w:t>20</w:t>
             </w:r>
           </w:p>
           <w:p>
@@ -26308,7 +26308,7 @@
                 <w:b/>
                 <w:sz w:val="16"/>
               </w:rPr>
-              <w:t>16-22</w:t>
+              <w:t>21</w:t>
             </w:r>
           </w:p>
           <w:p>
@@ -26331,7 +26331,7 @@
                 <w:b/>
                 <w:sz w:val="16"/>
               </w:rPr>
-              <w:t>16-22</w:t>
+              <w:t>21</w:t>
             </w:r>
           </w:p>
           <w:p>
@@ -26354,7 +26354,7 @@
                 <w:b/>
                 <w:sz w:val="16"/>
               </w:rPr>
-              <w:t>16-22</w:t>
+              <w:t>21</w:t>
             </w:r>
           </w:p>
           <w:p>
@@ -26379,7 +26379,7 @@
                 <w:b/>
                 <w:sz w:val="16"/>
               </w:rPr>
-              <w:t>16-22</w:t>
+              <w:t>21</w:t>
             </w:r>
           </w:p>
           <w:p>
@@ -26402,7 +26402,7 @@
                 <w:b/>
                 <w:sz w:val="16"/>
               </w:rPr>
-              <w:t>16-22</w:t>
+              <w:t>21</w:t>
             </w:r>
           </w:p>
           <w:p>
@@ -26425,7 +26425,7 @@
                 <w:b/>
                 <w:sz w:val="16"/>
               </w:rPr>
-              <w:t>16-22</w:t>
+              <w:t>21</w:t>
             </w:r>
           </w:p>
           <w:p>
@@ -26450,7 +26450,7 @@
                 <w:b/>
                 <w:sz w:val="16"/>
               </w:rPr>
-              <w:t>16-22</w:t>
+              <w:t>22</w:t>
             </w:r>
           </w:p>
           <w:p>
@@ -26473,7 +26473,7 @@
                 <w:b/>
                 <w:sz w:val="16"/>
               </w:rPr>
-              <w:t>16-22</w:t>
+              <w:t>22</w:t>
             </w:r>
           </w:p>
           <w:p>
@@ -26496,7 +26496,7 @@
                 <w:b/>
                 <w:sz w:val="16"/>
               </w:rPr>
-              <w:t>16-22</w:t>
+              <w:t>22</w:t>
             </w:r>
           </w:p>
           <w:p>
@@ -26521,7 +26521,7 @@
                 <w:b/>
                 <w:sz w:val="16"/>
               </w:rPr>
-              <w:t>16-22</w:t>
+              <w:t>22</w:t>
             </w:r>
           </w:p>
           <w:p>
@@ -26544,7 +26544,7 @@
                 <w:b/>
                 <w:sz w:val="16"/>
               </w:rPr>
-              <w:t>16-22</w:t>
+              <w:t>22</w:t>
             </w:r>
           </w:p>
           <w:p>
@@ -26567,7 +26567,7 @@
                 <w:b/>
                 <w:sz w:val="16"/>
               </w:rPr>
-              <w:t>16-22</w:t>
+              <w:t>22</w:t>
             </w:r>
           </w:p>
           <w:p>
@@ -27097,7 +27097,7 @@
                 <w:b/>
                 <w:sz w:val="16"/>
               </w:rPr>
-              <w:t>30-31</w:t>
+              <w:t>31</w:t>
             </w:r>
           </w:p>
           <w:p>
@@ -27120,7 +27120,7 @@
                 <w:b/>
                 <w:sz w:val="16"/>
               </w:rPr>
-              <w:t>30-31</w:t>
+              <w:t>31</w:t>
             </w:r>
           </w:p>
           <w:p>
@@ -27143,7 +27143,7 @@
                 <w:b/>
                 <w:sz w:val="16"/>
               </w:rPr>
-              <w:t>30-31</w:t>
+              <w:t>31</w:t>
             </w:r>
           </w:p>
           <w:p>
@@ -27239,7 +27239,7 @@
                 <w:b/>
                 <w:sz w:val="16"/>
               </w:rPr>
-              <w:t>33-34</w:t>
+              <w:t>33</w:t>
             </w:r>
           </w:p>
           <w:p>
@@ -27270,7 +27270,7 @@
                 <w:b/>
                 <w:sz w:val="16"/>
               </w:rPr>
-              <w:t>33-34</w:t>
+              <w:t>33</w:t>
             </w:r>
           </w:p>
           <w:p>
@@ -27293,7 +27293,7 @@
                 <w:b/>
                 <w:sz w:val="16"/>
               </w:rPr>
-              <w:t>33-34</w:t>
+              <w:t>33</w:t>
             </w:r>
           </w:p>
           <w:p>
@@ -27318,7 +27318,7 @@
                 <w:b/>
                 <w:sz w:val="16"/>
               </w:rPr>
-              <w:t>33-34</w:t>
+              <w:t>34</w:t>
             </w:r>
           </w:p>
           <w:p>
@@ -27341,7 +27341,7 @@
                 <w:b/>
                 <w:sz w:val="16"/>
               </w:rPr>
-              <w:t>33-34</w:t>
+              <w:t>34</w:t>
             </w:r>
           </w:p>
           <w:p>
@@ -27364,7 +27364,7 @@
                 <w:b/>
                 <w:sz w:val="16"/>
               </w:rPr>
-              <w:t>33-34</w:t>
+              <w:t>34</w:t>
             </w:r>
           </w:p>
           <w:p>
@@ -27949,7 +27949,7 @@
                 <w:b/>
                 <w:sz w:val="16"/>
               </w:rPr>
-              <w:t>1-5</w:t>
+              <w:t>1-4</w:t>
             </w:r>
           </w:p>
           <w:p>
@@ -27980,7 +27980,7 @@
                 <w:b/>
                 <w:sz w:val="16"/>
               </w:rPr>
-              <w:t>1-5</w:t>
+              <w:t>1-4</w:t>
             </w:r>
           </w:p>
           <w:p>
@@ -28003,7 +28003,7 @@
                 <w:b/>
                 <w:sz w:val="16"/>
               </w:rPr>
-              <w:t>1-5</w:t>
+              <w:t>1-4</w:t>
             </w:r>
           </w:p>
           <w:p>
@@ -28028,7 +28028,7 @@
                 <w:b/>
                 <w:sz w:val="16"/>
               </w:rPr>
-              <w:t>1-5</w:t>
+              <w:t>5</w:t>
             </w:r>
           </w:p>
           <w:p>
@@ -28051,7 +28051,7 @@
                 <w:b/>
                 <w:sz w:val="16"/>
               </w:rPr>
-              <w:t>1-5</w:t>
+              <w:t>5</w:t>
             </w:r>
           </w:p>
           <w:p>
@@ -28074,7 +28074,7 @@
                 <w:b/>
                 <w:sz w:val="16"/>
               </w:rPr>
-              <w:t>1-5</w:t>
+              <w:t>5</w:t>
             </w:r>
           </w:p>
           <w:p>
@@ -28241,7 +28241,7 @@
                 <w:b/>
                 <w:sz w:val="16"/>
               </w:rPr>
-              <w:t>10-13</w:t>
+              <w:t>10</w:t>
             </w:r>
           </w:p>
           <w:p>
@@ -28272,7 +28272,7 @@
                 <w:b/>
                 <w:sz w:val="16"/>
               </w:rPr>
-              <w:t>10-13</w:t>
+              <w:t>10</w:t>
             </w:r>
           </w:p>
           <w:p>
@@ -28295,7 +28295,7 @@
                 <w:b/>
                 <w:sz w:val="16"/>
               </w:rPr>
-              <w:t>10-13</w:t>
+              <w:t>10</w:t>
             </w:r>
           </w:p>
           <w:p>

</xml_diff>